<commit_message>
16 yeni organik talimat onaylandı ve imzalandı
Co-Authored-By: Claude Sonnet 5.5 <noreply@anthropic.com>
Claude-Session: https://claude.ai/code/session_01J6foNXTwf1dGzDjULYpfrk
</commit_message>
<xml_diff>
--- a/prosedurler/EMS.OR.TL.21.03. Organic Raw Material Area Instruction.docx
+++ b/prosedurler/EMS.OR.TL.21.03. Organic Raw Material Area Instruction.docx
@@ -2777,6 +2777,43 @@
                 <w:lang w:val="en-GB" w:eastAsia="en-GB"/>
               </w:rPr>
             </w:pPr>
+            <w:r>
+              <w:drawing>
+                <wp:inline distT="0" distB="0" distL="0" distR="0">
+                  <wp:extent cx="659218" cy="566928"/>
+                  <wp:effectExtent l="0" t="0" r="0" b="0"/>
+                  <wp:docPr id="900102" name="Imza Ali Kaan Genc"/>
+                  <wp:cNvGraphicFramePr>
+                    <a:graphicFrameLocks xmlns:a="http://schemas.openxmlformats.org/drawingml/2006/main" noChangeAspect="1"/>
+                  </wp:cNvGraphicFramePr>
+                  <a:graphic xmlns:a="http://schemas.openxmlformats.org/drawingml/2006/main">
+                    <a:graphicData uri="http://schemas.openxmlformats.org/drawingml/2006/picture">
+                      <pic:pic xmlns:pic="http://schemas.openxmlformats.org/drawingml/2006/picture">
+                        <pic:nvPicPr>
+                          <pic:cNvPr id="900102" name="Imza Ali Kaan Genc"/>
+                          <pic:cNvPicPr/>
+                        </pic:nvPicPr>
+                        <pic:blipFill>
+                          <a:blip r:embed="sigAliKaan"/>
+                          <a:stretch>
+                            <a:fillRect/>
+                          </a:stretch>
+                        </pic:blipFill>
+                        <pic:spPr>
+                          <a:xfrm>
+                            <a:off x="0" y="0"/>
+                            <a:ext cx="659218" cy="566928"/>
+                          </a:xfrm>
+                          <a:prstGeom prst="rect">
+                            <a:avLst/>
+                          </a:prstGeom>
+                        </pic:spPr>
+                      </pic:pic>
+                    </a:graphicData>
+                  </a:graphic>
+                </wp:inline>
+              </w:drawing>
+            </w:r>
           </w:p>
         </w:tc>
         <w:tc>
@@ -2827,6 +2864,43 @@
                 <w:lang w:val="en-GB" w:eastAsia="en-GB"/>
               </w:rPr>
             </w:pPr>
+            <w:r>
+              <w:drawing>
+                <wp:inline distT="0" distB="0" distL="0" distR="0">
+                  <wp:extent cx="850392" cy="566928"/>
+                  <wp:effectExtent l="0" t="0" r="0" b="0"/>
+                  <wp:docPr id="900104" name="Imza Abdullah Baydogan"/>
+                  <wp:cNvGraphicFramePr>
+                    <a:graphicFrameLocks xmlns:a="http://schemas.openxmlformats.org/drawingml/2006/main" noChangeAspect="1"/>
+                  </wp:cNvGraphicFramePr>
+                  <a:graphic xmlns:a="http://schemas.openxmlformats.org/drawingml/2006/main">
+                    <a:graphicData uri="http://schemas.openxmlformats.org/drawingml/2006/picture">
+                      <pic:pic xmlns:pic="http://schemas.openxmlformats.org/drawingml/2006/picture">
+                        <pic:nvPicPr>
+                          <pic:cNvPr id="900104" name="Imza Abdullah Baydogan"/>
+                          <pic:cNvPicPr/>
+                        </pic:nvPicPr>
+                        <pic:blipFill>
+                          <a:blip r:embed="rId9"/>
+                          <a:stretch>
+                            <a:fillRect/>
+                          </a:stretch>
+                        </pic:blipFill>
+                        <pic:spPr>
+                          <a:xfrm>
+                            <a:off x="0" y="0"/>
+                            <a:ext cx="850392" cy="566928"/>
+                          </a:xfrm>
+                          <a:prstGeom prst="rect">
+                            <a:avLst/>
+                          </a:prstGeom>
+                        </pic:spPr>
+                      </pic:pic>
+                    </a:graphicData>
+                  </a:graphic>
+                </wp:inline>
+              </w:drawing>
+            </w:r>
           </w:p>
         </w:tc>
         <w:tc>
@@ -2877,6 +2951,43 @@
                 <w:lang w:val="en-GB" w:eastAsia="en-GB"/>
               </w:rPr>
             </w:pPr>
+            <w:r>
+              <w:drawing>
+                <wp:inline distT="0" distB="0" distL="0" distR="0">
+                  <wp:extent cx="944879" cy="566928"/>
+                  <wp:effectExtent l="0" t="0" r="0" b="0"/>
+                  <wp:docPr id="900106" name="Imza Fatih Salbars"/>
+                  <wp:cNvGraphicFramePr>
+                    <a:graphicFrameLocks xmlns:a="http://schemas.openxmlformats.org/drawingml/2006/main" noChangeAspect="1"/>
+                  </wp:cNvGraphicFramePr>
+                  <a:graphic xmlns:a="http://schemas.openxmlformats.org/drawingml/2006/main">
+                    <a:graphicData uri="http://schemas.openxmlformats.org/drawingml/2006/picture">
+                      <pic:pic xmlns:pic="http://schemas.openxmlformats.org/drawingml/2006/picture">
+                        <pic:nvPicPr>
+                          <pic:cNvPr id="900106" name="Imza Fatih Salbars"/>
+                          <pic:cNvPicPr/>
+                        </pic:nvPicPr>
+                        <pic:blipFill>
+                          <a:blip r:embed="sigFatih"/>
+                          <a:stretch>
+                            <a:fillRect/>
+                          </a:stretch>
+                        </pic:blipFill>
+                        <pic:spPr>
+                          <a:xfrm>
+                            <a:off x="0" y="0"/>
+                            <a:ext cx="944879" cy="566928"/>
+                          </a:xfrm>
+                          <a:prstGeom prst="rect">
+                            <a:avLst/>
+                          </a:prstGeom>
+                        </pic:spPr>
+                      </pic:pic>
+                    </a:graphicData>
+                  </a:graphic>
+                </wp:inline>
+              </w:drawing>
+            </w:r>
           </w:p>
         </w:tc>
       </w:tr>
@@ -3790,7 +3901,7 @@
               <w:sz w:val="16"/>
               <w:szCs w:val="16"/>
             </w:rPr>
-            <w:t/>
+            <w:t>2</w:t>
           </w:r>
           <w:r>
             <w:rPr>
@@ -3798,7 +3909,7 @@
               <w:sz w:val="16"/>
               <w:szCs w:val="16"/>
             </w:rPr>
-            <w:t>-</w:t>
+            <w:t>2.10.2026</w:t>
           </w:r>
         </w:p>
         <w:p>

</xml_diff>